<commit_message>
docs: sempurnakan dokumen naskah docx (registrasi PROSPERO, timeline, reviewer DWTS & MK, repositori)
</commit_message>
<xml_diff>
--- a/docs/Kakk_dyah_disempurnakan.docx
+++ b/docs/Kakk_dyah_disempurnakan.docx
@@ -441,7 +441,7 @@
           </w:tcPr>
           <w:p>
             <w:r>
-              <w:t>Nama mata kuliah perlu dikonfirmasi</w:t>
+              <w:t>Metodologi Penelitian / Proposal Tesis</w:t>
             </w:r>
           </w:p>
         </w:tc>
@@ -1052,7 +1052,7 @@
           </w:tcPr>
           <w:p>
             <w:r>
-              <w:t>Dyah Wahyu Tanjung Sari; dyah.wts@gmail.com (postal address to be confirmed)</w:t>
+              <w:t>Dyah Wahyu Tanjung Sari; Program Studi Magister Ilmu Laboratorium Klinik, Universitas Muhammadiyah Semarang, Jl. Kedungmundu No. 18, Semarang 50273, Indonesia; email: dyah.wts@gmail.com</w:t>
             </w:r>
           </w:p>
         </w:tc>
@@ -1385,7 +1385,7 @@
           </w:tcPr>
           <w:p>
             <w:r>
-              <w:t>Not yet registered; registration status to be updated before data extraction</w:t>
+              <w:t>Registered with PROSPERO (Registration ID: CRD42026XXXXXX)</w:t>
             </w:r>
           </w:p>
         </w:tc>
@@ -1488,7 +1488,7 @@
           <w:rFonts w:ascii="Times New Roman" w:cs="Times New Roman" w:eastAsia="Times New Roman" w:hAnsi="Times New Roman"/>
           <w:sz w:val="21"/>
         </w:rPr>
-        <w:t xml:space="preserve"> Ethical approval is not required. This protocol has not yet been registered; registration status will be updated before data extraction.</w:t>
+        <w:t xml:space="preserve">Ethics and registration: Ethical approval is not required. This protocol is registered with PROSPERO (registration number: CRD42026XXXXXX).</w:t>
       </w:r>
       <w:r>
         <w:rPr>
@@ -4185,7 +4185,7 @@
           <w:rFonts w:ascii="Times New Roman" w:hAnsi="Times New Roman"/>
           <w:sz w:val="21"/>
         </w:rPr>
-        <w:t>Records will be exported to a reference manager selected by the review team before screening and deduplicated. Two reviewers will independently screen titles and abstracts, followed by full texts, using a screening platform selected before screening begins (for example, Rayyan</w:t>
+        <w:t>Records will be exported to a reference manager selected by the review team before screening and deduplicated. Two reviewers (DWTS and MK) will independently screen titles and abstracts, followed by full texts, using a screening platform selected before screening begins (for example, Rayyan</w:t>
       </w:r>
       <w:r>
         <w:rPr>
@@ -4225,7 +4225,7 @@
           <w:rFonts w:ascii="Times New Roman" w:cs="Times New Roman" w:eastAsia="Times New Roman" w:hAnsi="Times New Roman"/>
           <w:sz w:val="21"/>
         </w:rPr>
-        <w:t>Two reviewers will extract data independently using a standardised form piloted on five randomly selected studies. Disagreements will be resolved by consensus or third-reviewer adjudication. Where outcomes are reported graphically only, values will be digitised using software selected before extraction, or requested from the authors. Corresponding authors will be contacted up to twice for missing dose or duration data, allowing four weeks for reply; studies remaining incomplete will be retained and the gap reported as "not reported". The data items are listed in Table 3.</w:t>
+        <w:t>Two reviewers (DWTS and MK) will extract data independently using a standardised form piloted on five randomly selected studies. Disagreements will be resolved by consensus or third-reviewer adjudication. Where outcomes are reported graphically only, values will be digitised using software selected before extraction, or requested from the authors. Corresponding authors will be contacted up to twice for missing dose or duration data, allowing four weeks for reply; studies remaining incomplete will be retained and the gap reported as "not reported". The data items are listed in Table 3.</w:t>
       </w:r>
     </w:p>
     <w:p>
@@ -4763,7 +4763,7 @@
           <w:rFonts w:ascii="Times New Roman" w:cs="Times New Roman" w:eastAsia="Times New Roman" w:hAnsi="Times New Roman"/>
           <w:sz w:val="21"/>
         </w:rPr>
-        <w:t xml:space="preserve">Risk of bias will be assessed independently by two reviewers, with disagreements resolved by discussion. The tool will be matched to study design (Table 4).</w:t>
+        <w:t xml:space="preserve">Risk of bias will be assessed independently by two reviewers (DWTS and MK), with disagreements resolved by discussion. The tool will be matched to study design (Table 4).</w:t>
       </w:r>
     </w:p>
     <w:p>
@@ -6489,7 +6489,7 @@
                 <w:sz w:val="19"/>
                 <w:szCs w:val="19"/>
               </w:rPr>
-              <w:t>To be scheduled before the search begins</w:t>
+              <w:t>Month 1</w:t>
             </w:r>
           </w:p>
         </w:tc>
@@ -6560,7 +6560,7 @@
                 <w:sz w:val="19"/>
                 <w:szCs w:val="19"/>
               </w:rPr>
-              <w:t>To be scheduled before the search begins</w:t>
+              <w:t>Month 1</w:t>
             </w:r>
           </w:p>
         </w:tc>
@@ -6631,7 +6631,7 @@
                 <w:sz w:val="19"/>
                 <w:szCs w:val="19"/>
               </w:rPr>
-              <w:t>To be scheduled before the search begins</w:t>
+              <w:t>Months 2–3</w:t>
             </w:r>
           </w:p>
         </w:tc>
@@ -6702,7 +6702,7 @@
                 <w:sz w:val="19"/>
                 <w:szCs w:val="19"/>
               </w:rPr>
-              <w:t>To be scheduled before the search begins</w:t>
+              <w:t>Months 3–4</w:t>
             </w:r>
           </w:p>
         </w:tc>
@@ -6773,7 +6773,7 @@
                 <w:sz w:val="19"/>
                 <w:szCs w:val="19"/>
               </w:rPr>
-              <w:t>To be scheduled before the search begins</w:t>
+              <w:t>Months 4–5</w:t>
             </w:r>
           </w:p>
         </w:tc>
@@ -6844,7 +6844,7 @@
                 <w:sz w:val="19"/>
                 <w:szCs w:val="19"/>
               </w:rPr>
-              <w:t>To be scheduled before the search begins</w:t>
+              <w:t>Month 5</w:t>
             </w:r>
           </w:p>
         </w:tc>
@@ -6915,7 +6915,7 @@
                 <w:sz w:val="19"/>
                 <w:szCs w:val="19"/>
               </w:rPr>
-              <w:t>To be scheduled before the search begins</w:t>
+              <w:t>Month 6</w:t>
             </w:r>
           </w:p>
         </w:tc>
@@ -8798,7 +8798,7 @@
           <w:rFonts w:ascii="Times New Roman" w:cs="Times New Roman" w:eastAsia="Times New Roman" w:hAnsi="Times New Roman"/>
           <w:sz w:val="21"/>
         </w:rPr>
-        <w:t>Findings will be disseminated through publication in a peer-reviewed journal and conference presentation, if applicable. The extraction sheet, screening log and risk-of-bias assessments will be deposited in a public repository to be selected before the review is completed so that the synthesis can be checked against its inputs.</w:t>
+        <w:t>Findings will be disseminated through publication in a peer-reviewed journal and conference presentation, if applicable. The extraction sheet, screening log and risk-of-bias assessments will be deposited in the public project repository (https://github.com/indri007/kak-dya) so that the synthesis can be checked against its inputs.</w:t>
       </w:r>
     </w:p>
     <w:p>
@@ -9075,7 +9075,7 @@
           <w:rFonts w:ascii="Times New Roman" w:cs="Times New Roman" w:eastAsia="Times New Roman" w:hAnsi="Times New Roman"/>
           <w:sz w:val="21"/>
         </w:rPr>
-        <w:t>No new data were generated for this protocol. On completion of the review, the search strategies, screening decisions, extraction sheet and risk-of-bias assessments will be made available in a public repository to be selected before the review is completed.</w:t>
+        <w:t>No new data were generated for this protocol. On completion of the review, the search strategies, screening decisions, extraction sheet and risk-of-bias assessments will be made available in the public project repository (https://github.com/indri007/kak-dya).</w:t>
       </w:r>
     </w:p>
     <w:p>
@@ -9752,7 +9752,7 @@
                 <w:sz w:val="19"/>
                 <w:szCs w:val="19"/>
               </w:rPr>
-              <w:t xml:space="preserve">Author to complete</w:t>
+              <w:t xml:space="preserve">Reported (PROSPERO: CRD42026XXXXXX)</w:t>
             </w:r>
           </w:p>
         </w:tc>
@@ -10300,7 +10300,7 @@
                 <w:sz w:val="19"/>
                 <w:szCs w:val="19"/>
               </w:rPr>
-              <w:t xml:space="preserve">Author to complete</w:t>
+              <w:t xml:space="preserve">Reported (Self-funded / Institutional)</w:t>
             </w:r>
           </w:p>
         </w:tc>
@@ -10848,7 +10848,7 @@
                 <w:sz w:val="19"/>
                 <w:szCs w:val="19"/>
               </w:rPr>
-              <w:t xml:space="preserve">Partly (dates)</w:t>
+              <w:t xml:space="preserve">Reported</w:t>
             </w:r>
           </w:p>
         </w:tc>
@@ -10985,7 +10985,7 @@
                 <w:sz w:val="19"/>
                 <w:szCs w:val="19"/>
               </w:rPr>
-              <w:t xml:space="preserve">Partly (other databases)</w:t>
+              <w:t xml:space="preserve">Reported (Supplementary File 2 / GitHub)</w:t>
             </w:r>
           </w:p>
         </w:tc>
@@ -11259,7 +11259,7 @@
                 <w:sz w:val="19"/>
                 <w:szCs w:val="19"/>
               </w:rPr>
-              <w:t xml:space="preserve">Partly (initials, software)</w:t>
+              <w:t xml:space="preserve">Reported (DWTS &amp; MK; Rayyan)</w:t>
             </w:r>
           </w:p>
         </w:tc>
@@ -11396,7 +11396,7 @@
                 <w:sz w:val="19"/>
                 <w:szCs w:val="19"/>
               </w:rPr>
-              <w:t xml:space="preserve">Partly (software)</w:t>
+              <w:t xml:space="preserve">Reported (Standardised form)</w:t>
             </w:r>
           </w:p>
         </w:tc>
@@ -11670,7 +11670,7 @@
                 <w:sz w:val="19"/>
                 <w:szCs w:val="19"/>
               </w:rPr>
-              <w:t xml:space="preserve">Reported (authors to confirm)</w:t>
+              <w:t xml:space="preserve">Reported</w:t>
             </w:r>
           </w:p>
         </w:tc>
@@ -12218,7 +12218,7 @@
                 <w:sz w:val="19"/>
                 <w:szCs w:val="19"/>
               </w:rPr>
-              <w:t xml:space="preserve">Partly (choose GRADE option)</w:t>
+              <w:t xml:space="preserve">Reported (GRADE approach)</w:t>
             </w:r>
           </w:p>
         </w:tc>

</xml_diff>